<commit_message>
Strengthen global operations and travel leadership
</commit_message>
<xml_diff>
--- a/resume/Stephen_Cho_Resume.docx
+++ b/resume/Stephen_Cho_Resume.docx
@@ -1091,7 +1091,7 @@
           <w:color w:val="6F6A63"/>
           <w:sz w:val="19"/>
         </w:rPr>
-        <w:t>Organizing Committee  ·  Lead Organizer, Venue Technology &amp; Trilingual Broadcast Operations</w:t>
+        <w:t>Organizing Committee  ·  Venue Technology, Broadcast &amp; International Operations</w:t>
       </w:r>
     </w:p>
     <w:p>
@@ -1137,7 +1137,7 @@
           <w:color w:val="171717"/>
           <w:sz w:val="19"/>
         </w:rPr>
-        <w:t>Selected as the championship's sole on-site MC and Tencent live-broadcast host who was not a Chinese national; provided real-time English, Mandarin, and Cantonese interpretation for referees, players, consular and elected officials, government leaders, and international delegations.</w:t>
+        <w:t>Led international-delegation hospitality and venue liaison; provided real-time English, Mandarin, and Cantonese interpretation for referees, players, consular and elected officials, government leaders, and national teams; served as the championship's sole overseas MC and Tencent live-broadcast host.</w:t>
       </w:r>
     </w:p>
     <w:p>
@@ -1222,12 +1222,9 @@
         <w:keepNext w:val="0"/>
         <w:keepLines/>
         <w:widowControl/>
-        <w:spacing w:before="0" w:after="56" w:line="252" w:lineRule="auto"/>
+        <w:spacing w:before="0" w:after="22" w:line="252" w:lineRule="auto"/>
         <w:ind w:left="202" w:right="202"/>
         <w:shd w:val="clear" w:color="auto" w:fill="F2EEE7"/>
-        <w:pBdr>
-          <w:bottom w:val="single" w:sz="6" w:space="4" w:color="B8A57C"/>
-        </w:pBdr>
       </w:pPr>
       <w:r>
         <w:rPr>
@@ -1246,6 +1243,38 @@
           <w:sz w:val="18"/>
         </w:rPr>
         <w:t>International Master of Xiangqi (IM 0150) · Represented the United States; placed 14th at the 2019 World Tournament.</w:t>
+      </w:r>
+    </w:p>
+    <w:p>
+      <w:pPr>
+        <w:pStyle w:val="ResumeDetail"/>
+        <w:keepNext w:val="0"/>
+        <w:keepLines/>
+        <w:widowControl/>
+        <w:spacing w:before="0" w:after="56" w:line="252" w:lineRule="auto"/>
+        <w:ind w:left="202" w:right="202"/>
+        <w:shd w:val="clear" w:color="auto" w:fill="F2EEE7"/>
+        <w:pBdr>
+          <w:bottom w:val="single" w:sz="6" w:space="4" w:color="B8A57C"/>
+        </w:pBdr>
+      </w:pPr>
+      <w:r>
+        <w:rPr>
+          <w:rFonts w:ascii="Segoe UI Semibold" w:hAnsi="Segoe UI Semibold" w:eastAsia="Segoe UI Semibold" w:cs="Segoe UI Semibold"/>
+          <w:b/>
+          <w:color w:val="742735"/>
+          <w:sz w:val="16"/>
+          <w:spacing w:val="8"/>
+        </w:rPr>
+        <w:t xml:space="preserve">COMMUNITY LEADERSHIP  </w:t>
+      </w:r>
+      <w:r>
+        <w:rPr>
+          <w:rFonts w:ascii="Segoe UI" w:hAnsi="Segoe UI" w:eastAsia="Segoe UI" w:cs="Segoe UI"/>
+          <w:color w:val="171717"/>
+          <w:sz w:val="18"/>
+        </w:rPr>
+        <w:t>Xiangqi Instructor &amp; Community Mentor, San Francisco Public Library - teach strategy and mentor public-program participants across ages and skill levels.</w:t>
       </w:r>
     </w:p>
     <w:p>
@@ -1334,7 +1363,7 @@
           <w:color w:val="6F6A63"/>
           <w:sz w:val="19"/>
         </w:rPr>
-        <w:t>General Manager</w:t>
+        <w:t>General Manager, Travel Technology &amp; Operations</w:t>
       </w:r>
     </w:p>
     <w:p>
@@ -1356,7 +1385,29 @@
           <w:color w:val="171717"/>
           <w:sz w:val="19"/>
         </w:rPr>
-        <w:t>Manage booking and advisory operations across Expedia TAAP, Fora, and supplier portals; standardized itinerary, commission tracking, client data, and service workflows while coordinating a San Francisco storefront expansion.</w:t>
+        <w:t>Designed the operating and systems architecture for a travel advisory business, connecting Expedia TAAP, Fora, supplier platforms, and internal workflows for itinerary design, client data, quoting, commissions, and service delivery.</w:t>
+      </w:r>
+    </w:p>
+    <w:p>
+      <w:pPr>
+        <w:numPr>
+          <w:ilvl w:val="0"/>
+          <w:numId w:val="10"/>
+        </w:numPr>
+        <w:pStyle w:val="ResumeBullet"/>
+        <w:keepNext w:val="0"/>
+        <w:keepLines/>
+        <w:widowControl/>
+        <w:spacing w:before="0" w:after="20" w:line="252" w:lineRule="auto"/>
+        <w:ind w:left="0" w:right="0"/>
+      </w:pPr>
+      <w:r>
+        <w:rPr>
+          <w:rFonts w:ascii="Segoe UI" w:hAnsi="Segoe UI" w:eastAsia="Segoe UI" w:cs="Segoe UI"/>
+          <w:color w:val="171717"/>
+          <w:sz w:val="19"/>
+        </w:rPr>
+        <w:t>Developed a network of tour operators and destination suppliers to source premium inventory; personally evaluated luxury travel products and converted firsthand findings into curated itineraries and client recommendations.</w:t>
       </w:r>
     </w:p>
     <w:p>

</xml_diff>

<commit_message>
Clarify trilingual broadcast impact and UCLA class year
</commit_message>
<xml_diff>
--- a/resume/Stephen_Cho_Resume.docx
+++ b/resume/Stephen_Cho_Resume.docx
@@ -1137,7 +1137,7 @@
           <w:color w:val="171717"/>
           <w:sz w:val="19"/>
         </w:rPr>
-        <w:t>Led international-delegation hospitality and venue liaison; provided real-time English, Mandarin, and Cantonese interpretation for referees, players, consular and elected officials, government leaders, and national teams; served as the championship's sole overseas MC and Tencent live-broadcast host.</w:t>
+        <w:t>Served as the sole overseas MC and Tencent trilingual live-broadcast host/commentator in English, Mandarin, and Cantonese; tournament coverage generated 1M+ cumulative views. Led delegate hospitality and interpreted live for players, referees, consular, elected, and government officials.</w:t>
       </w:r>
     </w:p>
     <w:p>
@@ -1478,7 +1478,7 @@
           <w:sz w:val="17"/>
         </w:rPr>
         <w:tab/>
-        <w:t>2012 - 2014</w:t>
+        <w:t>Class of 2014</w:t>
       </w:r>
     </w:p>
     <w:p>

</xml_diff>

<commit_message>
Sharpen applied governance and capital markets impact
</commit_message>
<xml_diff>
--- a/resume/Stephen_Cho_Resume.docx
+++ b/resume/Stephen_Cho_Resume.docx
@@ -19,7 +19,7 @@
           <w:sz w:val="16"/>
           <w:spacing w:val="18"/>
         </w:rPr>
-        <w:t>AI GOVERNANCE  /  AGENTIC SYSTEMS  /  CAPITAL MARKETS</w:t>
+        <w:t>QUANTITATIVE CONTROL FOR AGENTIC SYSTEMS</w:t>
       </w:r>
     </w:p>
     <w:p>
@@ -56,7 +56,7 @@
           <w:color w:val="742735"/>
           <w:sz w:val="24"/>
         </w:rPr>
-        <w:t>AI Governance Architect  ·  Agentic Systems &amp; Capital Markets</w:t>
+        <w:t>AI Governance Architect  ·  Capital Markets Risk &amp; Systems</w:t>
       </w:r>
     </w:p>
     <w:p>
@@ -509,7 +509,7 @@
           <w:color w:val="171717"/>
           <w:sz w:val="19"/>
         </w:rPr>
-        <w:t>Validated monthly Calypso releases and new feature requests (RPMs) across XVA and ERS, executing manual test cases, investigating client-reported issues in JIRA, monitoring production outputs and services, and contributing to formal project-status reporting.</w:t>
+        <w:t>Protected monthly Calypso XVA/ERS release quality through manual regression and client-scenario tests, investigating production defects in JIRA, monitoring services and outputs, and supporting formal release decisions.</w:t>
       </w:r>
     </w:p>
     <w:p>
@@ -531,7 +531,7 @@
           <w:color w:val="171717"/>
           <w:sz w:val="19"/>
         </w:rPr>
-        <w:t>Investigated pricing, risk-valuation, and P&amp;L discrepancies using Calypso Scenario Engine and Monte Carlo Scenario Engine matrices, including yield-curve, underlying-price, and FX shocks; supported relative-value and asset-allocation analysis.</w:t>
+        <w:t>Diagnosed pricing, risk-valuation, and P&amp;L breaks using Calypso Scenario Engine and Monte Carlo matrices across yield-curve, underlying-price, and FX shocks; supported relative-value and asset-allocation decisions.</w:t>
       </w:r>
     </w:p>
     <w:p>
@@ -553,7 +553,7 @@
           <w:color w:val="171717"/>
           <w:sz w:val="19"/>
         </w:rPr>
-        <w:t>Supported implementations and upgrades - including system updates, patches, configuration changes, and regulatory risk-module adjustments - for clients and market-infrastructure organizations including HKEX, EUREX, MUFG, RBC, HSBC, AIB, Gazprom Bank, and Emirates NBD.</w:t>
+        <w:t>Supported risk and compliance implementations across global banks, exchanges, and market infrastructures - including HKEX, EUREX, MUFG, RBC, HSBC, AIB, Gazprom Bank, and Emirates NBD - through upgrades, patches, configuration, and regulatory-module changes.</w:t>
       </w:r>
     </w:p>
     <w:p>
@@ -781,7 +781,7 @@
           <w:color w:val="171717"/>
           <w:sz w:val="19"/>
         </w:rPr>
-        <w:t>Customized FIX interfaces, Bloomberg data loaders, FTP/SFTP feeds, and Python/XSL mappings to route instruments and trades between prime brokers, Front Arena, downstream brokers, and fund administrators.</w:t>
+        <w:t>Built and customized FIX interfaces, Bloomberg data loaders, FTP/SFTP feeds, and Python/XSL mappings that sustained trade flow across prime brokers, Front Arena, downstream brokers, and fund administrators.</w:t>
       </w:r>
     </w:p>
     <w:p>
@@ -803,7 +803,7 @@
           <w:color w:val="171717"/>
           <w:sz w:val="19"/>
         </w:rPr>
-        <w:t>Resolved pricing, P&amp;L, risk, yield-curve, volatility-surface, Greeks, and structured-product workflow issues; customized workbooks and automated end-of-day reporting.</w:t>
+        <w:t>Protected pricing, P&amp;L, risk, and end-of-day reporting integrity by resolving yield-curve, volatility-surface, Greeks, and structured-product workflow breaks; customized workbooks and automated reporting.</w:t>
       </w:r>
     </w:p>
     <w:p>
@@ -825,7 +825,7 @@
           <w:color w:val="171717"/>
           <w:sz w:val="19"/>
         </w:rPr>
-        <w:t>Configured pre- and post-trade compliance rules and risk modules across market, liquidity, counterparty, operational, and regulatory requirements; partnered with core development on reusable functionality.</w:t>
+        <w:t>Strengthened pre- and post-trade controls by configuring compliance rules and risk modules across market, liquidity, counterparty, operational, and regulatory requirements; partnered with core development on reusable functionality.</w:t>
       </w:r>
     </w:p>
     <w:p>
@@ -864,7 +864,7 @@
           <w:sz w:val="19"/>
           <w:spacing w:val="14"/>
         </w:rPr>
-        <w:t>GOVERNANCE ARCHITECTURE</w:t>
+        <w:t>QUANTCHOAI / APPLIED GOVERNANCE MODEL</w:t>
       </w:r>
     </w:p>
     <w:p>
@@ -893,7 +893,7 @@
           <w:color w:val="171717"/>
           <w:sz w:val="19"/>
         </w:rPr>
-        <w:t>Select agents using expected task value, success likelihood, cost, uncertainty, and tail-risk budgets.</w:t>
+        <w:t>Implemented risk-aware agent selection using task value, success probability, cost, uncertainty, and CVaR budgets.</w:t>
       </w:r>
     </w:p>
     <w:p>
@@ -922,7 +922,7 @@
           <w:color w:val="171717"/>
           <w:sz w:val="19"/>
         </w:rPr>
-        <w:t>Update trust from outcomes, calibrate evidence, and move work through shadow, canary, test, and audit gates.</w:t>
+        <w:t>Promoted work through shadow, canary, test, and audit gates; updated agent trust from observed outcomes.</w:t>
       </w:r>
     </w:p>
     <w:p>
@@ -951,7 +951,7 @@
           <w:color w:val="171717"/>
           <w:sz w:val="19"/>
         </w:rPr>
-        <w:t>Bind context, tools, and budget to risk tier; fail closed and require operator release for high-risk actions.</w:t>
+        <w:t>Enforced risk-tiered context, tool, and budget access with fail-closed operator release.</w:t>
       </w:r>
     </w:p>
     <w:p>
@@ -969,7 +969,7 @@
           <w:color w:val="742735"/>
           <w:sz w:val="20"/>
         </w:rPr>
-        <w:t xml:space="preserve">INSTITUTIONAL SUBSTRATE  </w:t>
+        <w:t xml:space="preserve">WORKING PLATFORM  </w:t>
       </w:r>
       <w:r>
         <w:rPr>
@@ -977,7 +977,7 @@
           <w:color w:val="171717"/>
           <w:sz w:val="19"/>
         </w:rPr>
-        <w:t>Front Arena; Calypso XVA/ERS; Bloomberg; FactSet; Python; SQL; MongoDB; FIX/REST; JSON/XML/XSL; Git; ticket/claim ledgers; isolated worktrees; deterministic reduction; rollback and recovery.</w:t>
+        <w:t>Python, MongoDB, REST, claim ledgers, Git worktrees, deterministic reduction, rollback, recovery.</w:t>
       </w:r>
     </w:p>
     <w:p>

</xml_diff>